<commit_message>
Consolidar calidad del banco, refactor del juego, tests unificados y CI.
Sustituye preguntas similares en el CSV, deduplica plantillas (pool 1289) y
centraliza la lógica de plantillas en utils_plantillas_core. Refactoriza entrada
por teclado, rutas lazy y carga única del dataset; migra la suite a Tests/ con
CI en GitHub Actions; corrige borrar_temporales y actualiza la documentación.

Co-authored-by: Cursor <cursoragent@cursor.com>
</commit_message>
<xml_diff>
--- a/Entrega/Memoria/Memoria_TFG_latex.docx
+++ b/Entrega/Memoria/Memoria_TFG_latex.docx
@@ -2336,6 +2336,15 @@
               <w:rPr>
                 <w:rStyle w:val="VerbatimChar"/>
               </w:rPr>
+              <w:t xml:space="preserve">entrada_teclas.py</w:t>
+            </w:r>
+            <w:r>
+              <w:br/>
+            </w:r>
+            <w:r>
+              <w:rPr>
+                <w:rStyle w:val="VerbatimChar"/>
+              </w:rPr>
               <w:t xml:space="preserve">entrada_menu.py</w:t>
             </w:r>
             <w:r>
@@ -2357,7 +2366,19 @@
               <w:jc w:val="left"/>
             </w:pPr>
             <w:r>
-              <w:t xml:space="preserve">Teclas, menús, pausa, ayuda</w:t>
+              <w:t xml:space="preserve">Teclas (</w:t>
+            </w:r>
+            <w:r>
+              <w:rPr>
+                <w:rStyle w:val="VerbatimChar"/>
+              </w:rPr>
+              <w:t xml:space="preserve">msvcrt</w:t>
+            </w:r>
+            <w:r>
+              <w:t xml:space="preserve"> </w:t>
+            </w:r>
+            <w:r>
+              <w:t xml:space="preserve">en Windows), menús, pausa, ayuda</w:t>
             </w:r>
           </w:p>
         </w:tc>
@@ -3022,6 +3043,12 @@
               </w:rPr>
               <w:t xml:space="preserve">duplicados.py revisar</w:t>
             </w:r>
+            <w:r>
+              <w:t xml:space="preserve"> </w:t>
+            </w:r>
+            <w:r>
+              <w:t xml:space="preserve">(0 pares similares en CSV y plantillas intra-materia, 2026-06-15)</w:t>
+            </w:r>
           </w:p>
         </w:tc>
       </w:tr>
@@ -3034,7 +3061,7 @@
               <w:jc w:val="left"/>
             </w:pPr>
             <w:r>
-              <w:t xml:space="preserve">Pruebas de regresión del juego</w:t>
+              <w:t xml:space="preserve">Pruebas de regresión</w:t>
             </w:r>
           </w:p>
         </w:tc>
@@ -3049,7 +3076,48 @@
               <w:rPr>
                 <w:rStyle w:val="VerbatimChar"/>
               </w:rPr>
-              <w:t xml:space="preserve">python -m unittest discover -s Juego/Tests -v</w:t>
+              <w:t xml:space="preserve">python -m unittest discover -s Tests -v</w:t>
+            </w:r>
+            <w:r>
+              <w:t xml:space="preserve"> </w:t>
+            </w:r>
+            <w:r>
+              <w:t xml:space="preserve">(51 tests)</w:t>
+            </w:r>
+          </w:p>
+        </w:tc>
+      </w:tr>
+      <w:tr>
+        <w:tc>
+          <w:tcPr/>
+          <w:p>
+            <w:pPr>
+              <w:pStyle w:val="Compact"/>
+              <w:jc w:val="left"/>
+            </w:pPr>
+            <w:r>
+              <w:t xml:space="preserve">Integración continua</w:t>
+            </w:r>
+          </w:p>
+        </w:tc>
+        <w:tc>
+          <w:tcPr/>
+          <w:p>
+            <w:pPr>
+              <w:pStyle w:val="Compact"/>
+              <w:jc w:val="left"/>
+            </w:pPr>
+            <w:r>
+              <w:t xml:space="preserve">GitHub Actions (</w:t>
+            </w:r>
+            <w:r>
+              <w:rPr>
+                <w:rStyle w:val="VerbatimChar"/>
+              </w:rPr>
+              <w:t xml:space="preserve">.github/workflows/ci.yml</w:t>
+            </w:r>
+            <w:r>
+              <w:t xml:space="preserve">)</w:t>
             </w:r>
           </w:p>
         </w:tc>
@@ -3372,21 +3440,39 @@
         <w:t xml:space="preserve">duplicados.py revisar</w:t>
       </w:r>
       <w:r>
-        <w:t xml:space="preserve">): detección de pares similares pendientes de sustitución (3 en CSV modo seguro,</w:t>
-      </w:r>
-      <w:r>
-        <w:t xml:space="preserve"> </w:t>
-      </w:r>
-      <m:oMath>
-        <m:r>
-          <m:rPr>
-            <m:sty m:val="p"/>
-          </m:rPr>
-          <m:t>∼</m:t>
-        </m:r>
-      </m:oMath>
-      <w:r>
-        <w:t xml:space="preserve">13 intra-materia en plantillas beta).</w:t>
+        <w:t xml:space="preserve">):</w:t>
+      </w:r>
+      <w:r>
+        <w:t xml:space="preserve"> </w:t>
+      </w:r>
+      <w:r>
+        <w:rPr>
+          <w:b/>
+          <w:bCs/>
+        </w:rPr>
+        <w:t xml:space="preserve">0 pares similares</w:t>
+      </w:r>
+      <w:r>
+        <w:t xml:space="preserve"> </w:t>
+      </w:r>
+      <w:r>
+        <w:t xml:space="preserve">en CSV y plantillas intra-materia tras sustituciones y deduplicación (junio 2026). Pool de plantillas beta:</w:t>
+      </w:r>
+      <w:r>
+        <w:t xml:space="preserve"> </w:t>
+      </w:r>
+      <w:r>
+        <w:rPr>
+          <w:b/>
+          <w:bCs/>
+        </w:rPr>
+        <w:t xml:space="preserve">1289</w:t>
+      </w:r>
+      <w:r>
+        <w:t xml:space="preserve"> </w:t>
+      </w:r>
+      <w:r>
+        <w:t xml:space="preserve">entradas.</w:t>
       </w:r>
     </w:p>
     <w:p>
@@ -3609,7 +3695,7 @@
               <w:t xml:space="preserve"> </w:t>
             </w:r>
             <w:r>
-              <w:t xml:space="preserve">(18 módulos)</w:t>
+              <w:t xml:space="preserve">(19 módulos)</w:t>
             </w:r>
           </w:p>
         </w:tc>
@@ -3766,13 +3852,50 @@
               <w:rPr>
                 <w:rStyle w:val="VerbatimChar"/>
               </w:rPr>
-              <w:t xml:space="preserve">Juego/Tests/</w:t>
+              <w:t xml:space="preserve">Tests/</w:t>
             </w:r>
             <w:r>
               <w:t xml:space="preserve"> </w:t>
             </w:r>
             <w:r>
-              <w:t xml:space="preserve">(informes, entrada, feedback, configuración)</w:t>
+              <w:t xml:space="preserve">—</w:t>
+            </w:r>
+            <w:r>
+              <w:t xml:space="preserve"> </w:t>
+            </w:r>
+            <w:r>
+              <w:rPr>
+                <w:b/>
+                <w:bCs/>
+              </w:rPr>
+              <w:t xml:space="preserve">51 tests</w:t>
+            </w:r>
+            <w:r>
+              <w:t xml:space="preserve"> </w:t>
+            </w:r>
+            <w:r>
+              <w:t xml:space="preserve">(</w:t>
+            </w:r>
+            <w:r>
+              <w:rPr>
+                <w:rStyle w:val="VerbatimChar"/>
+              </w:rPr>
+              <w:t xml:space="preserve">Tests/Juego/</w:t>
+            </w:r>
+            <w:r>
+              <w:t xml:space="preserve">,</w:t>
+            </w:r>
+            <w:r>
+              <w:t xml:space="preserve"> </w:t>
+            </w:r>
+            <w:r>
+              <w:rPr>
+                <w:rStyle w:val="VerbatimChar"/>
+              </w:rPr>
+              <w:t xml:space="preserve">Tests/Scripts/</w:t>
+            </w:r>
+            <w:r>
+              <w:t xml:space="preserve">); CI en GitHub Actions</w:t>
             </w:r>
           </w:p>
         </w:tc>
@@ -4676,7 +4799,7 @@
         <w:t xml:space="preserve">mantenimiento.py</w:t>
       </w:r>
       <w:r>
-        <w:t xml:space="preserve">): validación, revisión, pipeline de plantillas, auditorías (salida en consola), deduplicación y estadísticas del histórico de qualificacions. Los scripts de regeneración masiva del CSV se aislaron en</w:t>
+        <w:t xml:space="preserve">): validación, revisión, pipeline de plantillas, auditorías (salida en consola), deduplicación y estadísticas del histórico de qualificacions. La lógica de claves de contenido y expansión de plantillas se centralizó en</w:t>
       </w:r>
       <w:r>
         <w:t xml:space="preserve"> </w:t>
@@ -4685,13 +4808,52 @@
         <w:rPr>
           <w:rStyle w:val="VerbatimChar"/>
         </w:rPr>
+        <w:t xml:space="preserve">utils_plantillas_core.py</w:t>
+      </w:r>
+      <w:r>
+        <w:t xml:space="preserve">, compartida con</w:t>
+      </w:r>
+      <w:r>
+        <w:t xml:space="preserve"> </w:t>
+      </w:r>
+      <w:r>
+        <w:rPr>
+          <w:rStyle w:val="VerbatimChar"/>
+        </w:rPr>
+        <w:t xml:space="preserve">Juego/Consola/datos.py</w:t>
+      </w:r>
+      <w:r>
+        <w:t xml:space="preserve">. Los scripts de regeneración masiva del CSV se aislaron en</w:t>
+      </w:r>
+      <w:r>
+        <w:t xml:space="preserve"> </w:t>
+      </w:r>
+      <w:r>
+        <w:rPr>
+          <w:rStyle w:val="VerbatimChar"/>
+        </w:rPr>
         <w:t xml:space="preserve">Files/Archivo/</w:t>
       </w:r>
       <w:r>
         <w:t xml:space="preserve"> </w:t>
       </w:r>
       <w:r>
-        <w:t xml:space="preserve">con protección de banco cerrado. Catálogo de comandos:</w:t>
+        <w:t xml:space="preserve">con protección de banco cerrado. Suite de pruebas en</w:t>
+      </w:r>
+      <w:r>
+        <w:t xml:space="preserve"> </w:t>
+      </w:r>
+      <w:r>
+        <w:rPr>
+          <w:rStyle w:val="VerbatimChar"/>
+        </w:rPr>
+        <w:t xml:space="preserve">Tests/</w:t>
+      </w:r>
+      <w:r>
+        <w:t xml:space="preserve"> </w:t>
+      </w:r>
+      <w:r>
+        <w:t xml:space="preserve">(51 tests) con CI en GitHub Actions. Catálogo de comandos:</w:t>
       </w:r>
       <w:r>
         <w:t xml:space="preserve"> </w:t>
@@ -7523,7 +7685,7 @@
               <w:jc w:val="left"/>
             </w:pPr>
             <w:r>
-              <w:t xml:space="preserve">Banco validado y tests; sin estudio con usuarios</w:t>
+              <w:t xml:space="preserve">Banco validado, 51 tests + CI; sin estudio con usuarios</w:t>
             </w:r>
           </w:p>
         </w:tc>
@@ -7600,7 +7762,49 @@
         <w:t xml:space="preserve"> </w:t>
       </w:r>
       <w:r>
-        <w:t xml:space="preserve">se garantiza con reglas de balance automatizadas. Quedan abiertas:</w:t>
+        <w:t xml:space="preserve">se garantiza con reglas de balance automatizadas. La</w:t>
+      </w:r>
+      <w:r>
+        <w:t xml:space="preserve"> </w:t>
+      </w:r>
+      <w:r>
+        <w:rPr>
+          <w:b/>
+          <w:bCs/>
+        </w:rPr>
+        <w:t xml:space="preserve">validez semántica</w:t>
+      </w:r>
+      <w:r>
+        <w:t xml:space="preserve"> </w:t>
+      </w:r>
+      <w:r>
+        <w:t xml:space="preserve">fina se reforzó en junio de 2026 (sustitución de pares similares en CSV y deduplicación del pool de plantillas;</w:t>
+      </w:r>
+      <w:r>
+        <w:t xml:space="preserve"> </w:t>
+      </w:r>
+      <w:r>
+        <w:rPr>
+          <w:rStyle w:val="VerbatimChar"/>
+        </w:rPr>
+        <w:t xml:space="preserve">duplicados.py revisar</w:t>
+      </w:r>
+      <w:r>
+        <w:t xml:space="preserve"> </w:t>
+      </w:r>
+      <m:oMath>
+        <m:r>
+          <m:rPr>
+            <m:sty m:val="p"/>
+          </m:rPr>
+          <m:t>→</m:t>
+        </m:r>
+      </m:oMath>
+      <w:r>
+        <w:t xml:space="preserve"> </w:t>
+      </w:r>
+      <w:r>
+        <w:t xml:space="preserve">0 pares similares). Queda abierta:</w:t>
       </w:r>
     </w:p>
     <w:p>
@@ -7621,33 +7825,6 @@
           <w:b/>
           <w:bCs/>
         </w:rPr>
-        <w:t xml:space="preserve">validez semántica</w:t>
-      </w:r>
-      <w:r>
-        <w:t xml:space="preserve"> </w:t>
-      </w:r>
-      <w:r>
-        <w:t xml:space="preserve">fina (algunos pares de ítems muy similares),</w:t>
-      </w:r>
-    </w:p>
-    <w:p>
-      <w:pPr>
-        <w:numPr>
-          <w:ilvl w:val="0"/>
-          <w:numId w:val="1005"/>
-        </w:numPr>
-      </w:pPr>
-      <w:r>
-        <w:t xml:space="preserve">y la</w:t>
-      </w:r>
-      <w:r>
-        <w:t xml:space="preserve"> </w:t>
-      </w:r>
-      <w:r>
-        <w:rPr>
-          <w:b/>
-          <w:bCs/>
-        </w:rPr>
         <w:t xml:space="preserve">validez predictiva</w:t>
       </w:r>
       <w:r>
@@ -8045,7 +8222,7 @@
         <w:t xml:space="preserve"> </w:t>
       </w:r>
       <w:r>
-        <w:t xml:space="preserve">en el CSV y en los filtros del juego, el desarrollo de la capa gráfica escape room o novela gráfica, y la sustitución de pares de ítems semánticamente similares detectados por la auditoría. Conviene además contrastar si las mecánicas de juego aumentan la práctica respecto a un listado estático —mediante un piloto con usuarios (n</w:t>
+        <w:t xml:space="preserve">en el CSV y en los filtros del juego, el desarrollo de la capa gráfica escape room o novela gráfica, y un piloto con usuarios (n</w:t>
       </w:r>
       <w:r>
         <w:t xml:space="preserve"> </w:t>
@@ -8062,7 +8239,7 @@
         <w:t xml:space="preserve"> </w:t>
       </w:r>
       <w:r>
-        <w:t xml:space="preserve">15–20, cuestionario SUS, tiempo de práctica)—, línea no formulada como hipótesis contrastada en este TFG por ausencia de datos. La integración con plataformas institucionales (Moodle, AulaWeb) completaría el despliegue en el grado.</w:t>
+        <w:t xml:space="preserve">15–20, cuestionario SUS, tiempo de práctica) para contrastar si las mecánicas de juego aumentan la práctica respecto a un listado estático —línea no formulada como hipótesis contrastada en este TFG por ausencia de datos. La integración con plataformas institucionales (Moodle, AulaWeb) completaría el despliegue en el grado.</w:t>
       </w:r>
     </w:p>
     <w:bookmarkEnd w:id="61"/>
@@ -9020,7 +9197,7 @@
               <w:rPr>
                 <w:rStyle w:val="VerbatimChar"/>
               </w:rPr>
-              <w:t xml:space="preserve">Juego/Tests/README.md</w:t>
+              <w:t xml:space="preserve">Tests/README.md</w:t>
             </w:r>
           </w:p>
         </w:tc>

</xml_diff>

<commit_message>
Extraer dominio a Comun y renombrar lanzador a juego_consola.
Refactor compartido: paquete Juego/Comun, compatibilidad de reglas en modo libre, juego_consola.py, eliminacion de wrappers en Consola y tests de regresion (57 tests). Sin interfaz grafica.

Co-authored-by: Cursor <cursoragent@cursor.com>
</commit_message>
<xml_diff>
--- a/Entrega/Memoria/Memoria_TFG_latex.docx
+++ b/Entrega/Memoria/Memoria_TFG_latex.docx
@@ -2109,7 +2109,7 @@
               <w:rPr>
                 <w:rStyle w:val="VerbatimChar"/>
               </w:rPr>
-              <w:t xml:space="preserve">juego_cuestionario.py</w:t>
+              <w:t xml:space="preserve">juego_consola.py</w:t>
             </w:r>
           </w:p>
         </w:tc>
@@ -2122,6 +2122,86 @@
             </w:pPr>
             <w:r>
               <w:t xml:space="preserve">Menú, tutorial de teclado, bucle de modos</w:t>
+            </w:r>
+          </w:p>
+        </w:tc>
+      </w:tr>
+      <w:tr>
+        <w:tc>
+          <w:tcPr/>
+          <w:p>
+            <w:pPr>
+              <w:pStyle w:val="Compact"/>
+              <w:jc w:val="left"/>
+            </w:pPr>
+            <w:r>
+              <w:t xml:space="preserve">Dominio</w:t>
+            </w:r>
+          </w:p>
+        </w:tc>
+        <w:tc>
+          <w:tcPr/>
+          <w:p>
+            <w:pPr>
+              <w:pStyle w:val="Compact"/>
+              <w:jc w:val="left"/>
+            </w:pPr>
+            <w:r>
+              <w:rPr>
+                <w:rStyle w:val="VerbatimChar"/>
+              </w:rPr>
+              <w:t xml:space="preserve">Juego/Comun/</w:t>
+            </w:r>
+            <w:r>
+              <w:t xml:space="preserve"> </w:t>
+            </w:r>
+            <w:r>
+              <w:t xml:space="preserve">(</w:t>
+            </w:r>
+            <w:r>
+              <w:rPr>
+                <w:rStyle w:val="VerbatimChar"/>
+              </w:rPr>
+              <w:t xml:space="preserve">motor_nucleo.py</w:t>
+            </w:r>
+            <w:r>
+              <w:t xml:space="preserve">,</w:t>
+            </w:r>
+            <w:r>
+              <w:t xml:space="preserve"> </w:t>
+            </w:r>
+            <w:r>
+              <w:rPr>
+                <w:rStyle w:val="VerbatimChar"/>
+              </w:rPr>
+              <w:t xml:space="preserve">reglas_partida.py</w:t>
+            </w:r>
+            <w:r>
+              <w:t xml:space="preserve">,</w:t>
+            </w:r>
+            <w:r>
+              <w:t xml:space="preserve"> </w:t>
+            </w:r>
+            <w:r>
+              <w:rPr>
+                <w:rStyle w:val="VerbatimChar"/>
+              </w:rPr>
+              <w:t xml:space="preserve">datos.py</w:t>
+            </w:r>
+            <w:r>
+              <w:t xml:space="preserve">, …)</w:t>
+            </w:r>
+          </w:p>
+        </w:tc>
+        <w:tc>
+          <w:tcPr/>
+          <w:p>
+            <w:pPr>
+              <w:pStyle w:val="Compact"/>
+              <w:jc w:val="left"/>
+            </w:pPr>
+            <w:r>
+              <w:t xml:space="preserve">Reglas, puntuación, pool, rutas compartidas</w:t>
             </w:r>
           </w:p>
         </w:tc>
@@ -2180,125 +2260,7 @@
               <w:jc w:val="left"/>
             </w:pPr>
             <w:r>
-              <w:t xml:space="preserve">Flujos pedagógicos distintos</w:t>
-            </w:r>
-          </w:p>
-        </w:tc>
-      </w:tr>
-      <w:tr>
-        <w:tc>
-          <w:tcPr/>
-          <w:p>
-            <w:pPr>
-              <w:pStyle w:val="Compact"/>
-              <w:jc w:val="left"/>
-            </w:pPr>
-            <w:r>
-              <w:t xml:space="preserve">Motor</w:t>
-            </w:r>
-          </w:p>
-        </w:tc>
-        <w:tc>
-          <w:tcPr/>
-          <w:p>
-            <w:pPr>
-              <w:pStyle w:val="Compact"/>
-              <w:jc w:val="left"/>
-            </w:pPr>
-            <w:r>
-              <w:rPr>
-                <w:rStyle w:val="VerbatimChar"/>
-              </w:rPr>
-              <w:t xml:space="preserve">motor_partida.py</w:t>
-            </w:r>
-            <w:r>
-              <w:br/>
-            </w:r>
-            <w:r>
-              <w:rPr>
-                <w:rStyle w:val="VerbatimChar"/>
-              </w:rPr>
-              <w:t xml:space="preserve">reglas_partida.py</w:t>
-            </w:r>
-            <w:r>
-              <w:br/>
-            </w:r>
-            <w:r>
-              <w:rPr>
-                <w:rStyle w:val="VerbatimChar"/>
-              </w:rPr>
-              <w:t xml:space="preserve">politica_reglas.py</w:t>
-            </w:r>
-          </w:p>
-        </w:tc>
-        <w:tc>
-          <w:tcPr/>
-          <w:p>
-            <w:pPr>
-              <w:pStyle w:val="Compact"/>
-              <w:jc w:val="left"/>
-            </w:pPr>
-            <w:r>
-              <w:t xml:space="preserve">Preguntas, vidas, puntuación, informes</w:t>
-            </w:r>
-          </w:p>
-        </w:tc>
-      </w:tr>
-      <w:tr>
-        <w:tc>
-          <w:tcPr/>
-          <w:p>
-            <w:pPr>
-              <w:pStyle w:val="Compact"/>
-              <w:jc w:val="left"/>
-            </w:pPr>
-            <w:r>
-              <w:t xml:space="preserve">Datos</w:t>
-            </w:r>
-          </w:p>
-        </w:tc>
-        <w:tc>
-          <w:tcPr/>
-          <w:p>
-            <w:pPr>
-              <w:pStyle w:val="Compact"/>
-              <w:jc w:val="left"/>
-            </w:pPr>
-            <w:r>
-              <w:rPr>
-                <w:rStyle w:val="VerbatimChar"/>
-              </w:rPr>
-              <w:t xml:space="preserve">datos.py</w:t>
-            </w:r>
-            <w:r>
-              <w:br/>
-            </w:r>
-            <w:r>
-              <w:rPr>
-                <w:rStyle w:val="VerbatimChar"/>
-              </w:rPr>
-              <w:t xml:space="preserve">modelos.py</w:t>
-            </w:r>
-            <w:r>
-              <w:br/>
-            </w:r>
-            <w:r>
-              <w:rPr>
-                <w:rStyle w:val="VerbatimChar"/>
-              </w:rPr>
-              <w:t xml:space="preserve">rutas.py</w:t>
-            </w:r>
-          </w:p>
-        </w:tc>
-        <w:tc>
-          <w:tcPr/>
-          <w:p>
-            <w:pPr>
-              <w:pStyle w:val="Compact"/>
-              <w:jc w:val="left"/>
-            </w:pPr>
-            <w:r>
-              <w:t xml:space="preserve">Carga CSV/JSON, metadatos, rutas</w:t>
+              <w:t xml:space="preserve">Flujos pedagógicos en terminal</w:t>
             </w:r>
           </w:p>
         </w:tc>
@@ -3082,7 +3044,7 @@
               <w:t xml:space="preserve"> </w:t>
             </w:r>
             <w:r>
-              <w:t xml:space="preserve">(51 tests)</w:t>
+              <w:t xml:space="preserve">(57 tests)</w:t>
             </w:r>
           </w:p>
         </w:tc>
@@ -3114,7 +3076,7 @@
               <w:rPr>
                 <w:rStyle w:val="VerbatimChar"/>
               </w:rPr>
-              <w:t xml:space="preserve">.github/workflows/ci.yml</w:t>
+              <w:t xml:space="preserve">.github/workflows/tests.yml</w:t>
             </w:r>
             <w:r>
               <w:t xml:space="preserve">)</w:t>
@@ -3556,23 +3518,7 @@
         <w:t xml:space="preserve"> </w:t>
       </w:r>
       <w:r>
-        <w:t xml:space="preserve">revisadas manualmente, herramientas de mantenimiento del dataset y empaquetado opcional en ejecutable Windows. La capa gráfica escape room / novela queda como evolución futura.</w:t>
-      </w:r>
-      <w:r>
-        <w:t xml:space="preserve"> </w:t>
-      </w:r>
-      <w:r>
-        <w:rPr>
-          <w:b/>
-          <w:bCs/>
-        </w:rPr>
-        <w:t xml:space="preserve">No se ha utilizado Pygame ni otro motor gráfico</w:t>
-      </w:r>
-      <w:r>
-        <w:t xml:space="preserve"> </w:t>
-      </w:r>
-      <w:r>
-        <w:t xml:space="preserve">en esta versión; la interfaz es exclusivamente textual en terminal.</w:t>
+        <w:t xml:space="preserve">revisadas manualmente, herramientas de mantenimiento del dataset y empaquetado opcional en ejecutable Windows. Una versión gráfica en pygame se desarrolla en rama aparte.</w:t>
       </w:r>
     </w:p>
     <w:p>
@@ -3639,7 +3585,7 @@
               <w:jc w:val="left"/>
             </w:pPr>
             <w:r>
-              <w:t xml:space="preserve">Lanzador</w:t>
+              <w:t xml:space="preserve">Lanzador consola</w:t>
             </w:r>
           </w:p>
         </w:tc>
@@ -3654,7 +3600,7 @@
               <w:rPr>
                 <w:rStyle w:val="VerbatimChar"/>
               </w:rPr>
-              <w:t xml:space="preserve">Juego/juego_cuestionario.py</w:t>
+              <w:t xml:space="preserve">Juego/juego_consola.py</w:t>
             </w:r>
             <w:r>
               <w:t xml:space="preserve"> </w:t>
@@ -3685,6 +3631,21 @@
               <w:pStyle w:val="Compact"/>
               <w:jc w:val="left"/>
             </w:pPr>
+            <w:r>
+              <w:rPr>
+                <w:rStyle w:val="VerbatimChar"/>
+              </w:rPr>
+              <w:t xml:space="preserve">Juego/Comun/</w:t>
+            </w:r>
+            <w:r>
+              <w:t xml:space="preserve"> </w:t>
+            </w:r>
+            <w:r>
+              <w:t xml:space="preserve">(dominio) +</w:t>
+            </w:r>
+            <w:r>
+              <w:t xml:space="preserve"> </w:t>
+            </w:r>
             <w:r>
               <w:rPr>
                 <w:rStyle w:val="VerbatimChar"/>
@@ -3695,7 +3656,7 @@
               <w:t xml:space="preserve"> </w:t>
             </w:r>
             <w:r>
-              <w:t xml:space="preserve">(19 módulos)</w:t>
+              <w:t xml:space="preserve">(UI terminal)</w:t>
             </w:r>
           </w:p>
         </w:tc>
@@ -3868,7 +3829,7 @@
                 <w:b/>
                 <w:bCs/>
               </w:rPr>
-              <w:t xml:space="preserve">51 tests</w:t>
+              <w:t xml:space="preserve">57 tests</w:t>
             </w:r>
             <w:r>
               <w:t xml:space="preserve"> </w:t>
@@ -4820,7 +4781,7 @@
         <w:rPr>
           <w:rStyle w:val="VerbatimChar"/>
         </w:rPr>
-        <w:t xml:space="preserve">Juego/Consola/datos.py</w:t>
+        <w:t xml:space="preserve">Juego/Comun/datos.py</w:t>
       </w:r>
       <w:r>
         <w:t xml:space="preserve">. Los scripts de regeneración masiva del CSV se aislaron en</w:t>
@@ -4853,7 +4814,7 @@
         <w:t xml:space="preserve"> </w:t>
       </w:r>
       <w:r>
-        <w:t xml:space="preserve">(51 tests) con CI en GitHub Actions. Catálogo de comandos:</w:t>
+        <w:t xml:space="preserve">(57 tests) con CI en GitHub Actions. Catálogo de comandos:</w:t>
       </w:r>
       <w:r>
         <w:t xml:space="preserve"> </w:t>
@@ -7631,19 +7592,28 @@
               <w:jc w:val="left"/>
             </w:pPr>
             <w:r>
-              <w:t xml:space="preserve">Pendiente (futuro)</w:t>
-            </w:r>
-          </w:p>
-        </w:tc>
-        <w:tc>
-          <w:tcPr/>
-          <w:p>
-            <w:pPr>
-              <w:pStyle w:val="Compact"/>
-              <w:jc w:val="left"/>
-            </w:pPr>
-            <w:r>
-              <w:t xml:space="preserve">Solo consola; Pygame no utilizado</w:t>
+              <w:t xml:space="preserve">Pendiente (rama feature)</w:t>
+            </w:r>
+          </w:p>
+        </w:tc>
+        <w:tc>
+          <w:tcPr/>
+          <w:p>
+            <w:pPr>
+              <w:pStyle w:val="Compact"/>
+              <w:jc w:val="left"/>
+            </w:pPr>
+            <w:r>
+              <w:t xml:space="preserve">Prototipo pygame en</w:t>
+            </w:r>
+            <w:r>
+              <w:t xml:space="preserve"> </w:t>
+            </w:r>
+            <w:r>
+              <w:rPr>
+                <w:rStyle w:val="VerbatimChar"/>
+              </w:rPr>
+              <w:t xml:space="preserve">feature/juego-grafico-pygame</w:t>
             </w:r>
           </w:p>
         </w:tc>
@@ -7685,7 +7655,7 @@
               <w:jc w:val="left"/>
             </w:pPr>
             <w:r>
-              <w:t xml:space="preserve">Banco validado, 51 tests + CI; sin estudio con usuarios</w:t>
+              <w:t xml:space="preserve">Banco validado, 57 tests + CI; sin estudio con usuarios</w:t>
             </w:r>
           </w:p>
         </w:tc>
@@ -7712,7 +7682,19 @@
         <w:t xml:space="preserve"> </w:t>
       </w:r>
       <w:r>
-        <w:t xml:space="preserve">OE2, OE3 y OE5 están cubiertos en su versión de consola. OE1 y OE4 (narrativa gráfica e interfaz visual) quedan explícitamente como trabajo futuro. Esta decisión es defendible: el prototipo valida el núcleo evaluable sin el coste de desarrollo gráfico, en línea con el principio de prototipado incremental en ingeniería del software.</w:t>
+        <w:t xml:space="preserve">OE2, OE3 y OE5 están cubiertos en su versión de consola. OE1 y OE4 (narrativa gráfica e interfaz visual) quedan como trabajo futuro; OE4 avanza en la rama</w:t>
+      </w:r>
+      <w:r>
+        <w:t xml:space="preserve"> </w:t>
+      </w:r>
+      <w:r>
+        <w:rPr>
+          <w:rStyle w:val="VerbatimChar"/>
+        </w:rPr>
+        <w:t xml:space="preserve">feature/juego-grafico-pygame</w:t>
+      </w:r>
+      <w:r>
+        <w:t xml:space="preserve">.</w:t>
       </w:r>
     </w:p>
     <w:bookmarkEnd w:id="56"/>

</xml_diff>

<commit_message>
Anadir interfaz grafica pygame y tests de paridad consola/grafico.
Incluye Juego/Grafico/, juego_grafico.py, requirements.txt con pygame-ce y 17 tests de paridad (74 tests en total).

Co-authored-by: Cursor <cursoragent@cursor.com>
</commit_message>
<xml_diff>
--- a/Entrega/Memoria/Memoria_TFG_latex.docx
+++ b/Entrega/Memoria/Memoria_TFG_latex.docx
@@ -2094,7 +2094,7 @@
               <w:jc w:val="left"/>
             </w:pPr>
             <w:r>
-              <w:t xml:space="preserve">Lanzador</w:t>
+              <w:t xml:space="preserve">Lanzadores</w:t>
             </w:r>
           </w:p>
         </w:tc>
@@ -2111,17 +2111,26 @@
               </w:rPr>
               <w:t xml:space="preserve">juego_consola.py</w:t>
             </w:r>
-          </w:p>
-        </w:tc>
-        <w:tc>
-          <w:tcPr/>
-          <w:p>
-            <w:pPr>
-              <w:pStyle w:val="Compact"/>
-              <w:jc w:val="left"/>
-            </w:pPr>
-            <w:r>
-              <w:t xml:space="preserve">Menú, tutorial de teclado, bucle de modos</w:t>
+            <w:r>
+              <w:br/>
+            </w:r>
+            <w:r>
+              <w:rPr>
+                <w:rStyle w:val="VerbatimChar"/>
+              </w:rPr>
+              <w:t xml:space="preserve">juego_grafico.py</w:t>
+            </w:r>
+          </w:p>
+        </w:tc>
+        <w:tc>
+          <w:tcPr/>
+          <w:p>
+            <w:pPr>
+              <w:pStyle w:val="Compact"/>
+              <w:jc w:val="left"/>
+            </w:pPr>
+            <w:r>
+              <w:t xml:space="preserve">Terminal y pygame (prototipo modo libre)</w:t>
             </w:r>
           </w:p>
         </w:tc>
@@ -2215,7 +2224,7 @@
               <w:jc w:val="left"/>
             </w:pPr>
             <w:r>
-              <w:t xml:space="preserve">Modos</w:t>
+              <w:t xml:space="preserve">Modos (consola)</w:t>
             </w:r>
           </w:p>
         </w:tc>
@@ -3044,7 +3053,7 @@
               <w:t xml:space="preserve"> </w:t>
             </w:r>
             <w:r>
-              <w:t xml:space="preserve">(57 tests)</w:t>
+              <w:t xml:space="preserve">(74 tests)</w:t>
             </w:r>
           </w:p>
         </w:tc>
@@ -3502,7 +3511,7 @@
         <w:t xml:space="preserve"> </w:t>
       </w:r>
       <w:r>
-        <w:t xml:space="preserve">cuestionario en consola con tres modos operativos (libre, historia, feedback), banco de</w:t>
+        <w:t xml:space="preserve">cuestionario en consola con tres modos operativos (libre, historia, feedback) y</w:t>
       </w:r>
       <w:r>
         <w:t xml:space="preserve"> </w:t>
@@ -3512,13 +3521,29 @@
           <w:b/>
           <w:bCs/>
         </w:rPr>
+        <w:t xml:space="preserve">prototipo gráfico</w:t>
+      </w:r>
+      <w:r>
+        <w:t xml:space="preserve"> </w:t>
+      </w:r>
+      <w:r>
+        <w:t xml:space="preserve">en pygame (modo libre), banco de</w:t>
+      </w:r>
+      <w:r>
+        <w:t xml:space="preserve"> </w:t>
+      </w:r>
+      <w:r>
+        <w:rPr>
+          <w:b/>
+          <w:bCs/>
+        </w:rPr>
         <w:t xml:space="preserve">480 preguntas</w:t>
       </w:r>
       <w:r>
         <w:t xml:space="preserve"> </w:t>
       </w:r>
       <w:r>
-        <w:t xml:space="preserve">revisadas manualmente, herramientas de mantenimiento del dataset y empaquetado opcional en ejecutable Windows. Una versión gráfica en pygame se desarrolla en rama aparte.</w:t>
+        <w:t xml:space="preserve">revisadas manualmente, herramientas de mantenimiento del dataset y empaquetado opcional en ejecutable Windows. La capa narrativa escape room / novela gráfica completa queda como evolución futura.</w:t>
       </w:r>
     </w:p>
     <w:p>
@@ -3620,6 +3645,56 @@
               <w:jc w:val="left"/>
             </w:pPr>
             <w:r>
+              <w:t xml:space="preserve">Lanzador gráfico</w:t>
+            </w:r>
+          </w:p>
+        </w:tc>
+        <w:tc>
+          <w:tcPr/>
+          <w:p>
+            <w:pPr>
+              <w:pStyle w:val="Compact"/>
+              <w:jc w:val="left"/>
+            </w:pPr>
+            <w:r>
+              <w:rPr>
+                <w:rStyle w:val="VerbatimChar"/>
+              </w:rPr>
+              <w:t xml:space="preserve">Juego/juego_grafico.py</w:t>
+            </w:r>
+            <w:r>
+              <w:t xml:space="preserve"> </w:t>
+            </w:r>
+            <w:r>
+              <w:t xml:space="preserve">+</w:t>
+            </w:r>
+            <w:r>
+              <w:t xml:space="preserve"> </w:t>
+            </w:r>
+            <w:r>
+              <w:rPr>
+                <w:rStyle w:val="VerbatimChar"/>
+              </w:rPr>
+              <w:t xml:space="preserve">Juego/Grafico/</w:t>
+            </w:r>
+            <w:r>
+              <w:t xml:space="preserve"> </w:t>
+            </w:r>
+            <w:r>
+              <w:t xml:space="preserve">(prototipo modo libre)</w:t>
+            </w:r>
+          </w:p>
+        </w:tc>
+      </w:tr>
+      <w:tr>
+        <w:tc>
+          <w:tcPr/>
+          <w:p>
+            <w:pPr>
+              <w:pStyle w:val="Compact"/>
+              <w:jc w:val="left"/>
+            </w:pPr>
+            <w:r>
               <w:t xml:space="preserve">Paquete de lógica</w:t>
             </w:r>
           </w:p>
@@ -3829,7 +3904,7 @@
                 <w:b/>
                 <w:bCs/>
               </w:rPr>
-              <w:t xml:space="preserve">57 tests</w:t>
+              <w:t xml:space="preserve">74 tests</w:t>
             </w:r>
             <w:r>
               <w:t xml:space="preserve"> </w:t>
@@ -4814,7 +4889,7 @@
         <w:t xml:space="preserve"> </w:t>
       </w:r>
       <w:r>
-        <w:t xml:space="preserve">(57 tests) con CI en GitHub Actions. Catálogo de comandos:</w:t>
+        <w:t xml:space="preserve">(74 tests) con CI en GitHub Actions. Catálogo de comandos:</w:t>
       </w:r>
       <w:r>
         <w:t xml:space="preserve"> </w:t>
@@ -7592,28 +7667,28 @@
               <w:jc w:val="left"/>
             </w:pPr>
             <w:r>
-              <w:t xml:space="preserve">Pendiente (rama feature)</w:t>
-            </w:r>
-          </w:p>
-        </w:tc>
-        <w:tc>
-          <w:tcPr/>
-          <w:p>
-            <w:pPr>
-              <w:pStyle w:val="Compact"/>
-              <w:jc w:val="left"/>
-            </w:pPr>
-            <w:r>
-              <w:t xml:space="preserve">Prototipo pygame en</w:t>
-            </w:r>
-            <w:r>
-              <w:t xml:space="preserve"> </w:t>
-            </w:r>
+              <w:t xml:space="preserve">Parcial (prototipo)</w:t>
+            </w:r>
+          </w:p>
+        </w:tc>
+        <w:tc>
+          <w:tcPr/>
+          <w:p>
+            <w:pPr>
+              <w:pStyle w:val="Compact"/>
+              <w:jc w:val="left"/>
+            </w:pPr>
             <w:r>
               <w:rPr>
                 <w:rStyle w:val="VerbatimChar"/>
               </w:rPr>
-              <w:t xml:space="preserve">feature/juego-grafico-pygame</w:t>
+              <w:t xml:space="preserve">juego_grafico.py</w:t>
+            </w:r>
+            <w:r>
+              <w:t xml:space="preserve"> </w:t>
+            </w:r>
+            <w:r>
+              <w:t xml:space="preserve">+ modo libre pygame; consola sigue siendo referencia completa</w:t>
             </w:r>
           </w:p>
         </w:tc>
@@ -7655,7 +7730,7 @@
               <w:jc w:val="left"/>
             </w:pPr>
             <w:r>
-              <w:t xml:space="preserve">Banco validado, 57 tests + CI; sin estudio con usuarios</w:t>
+              <w:t xml:space="preserve">Banco validado, 74 tests + CI; sin estudio con usuarios</w:t>
             </w:r>
           </w:p>
         </w:tc>
@@ -7682,19 +7757,7 @@
         <w:t xml:space="preserve"> </w:t>
       </w:r>
       <w:r>
-        <w:t xml:space="preserve">OE2, OE3 y OE5 están cubiertos en su versión de consola. OE1 y OE4 (narrativa gráfica e interfaz visual) quedan como trabajo futuro; OE4 avanza en la rama</w:t>
-      </w:r>
-      <w:r>
-        <w:t xml:space="preserve"> </w:t>
-      </w:r>
-      <w:r>
-        <w:rPr>
-          <w:rStyle w:val="VerbatimChar"/>
-        </w:rPr>
-        <w:t xml:space="preserve">feature/juego-grafico-pygame</w:t>
-      </w:r>
-      <w:r>
-        <w:t xml:space="preserve">.</w:t>
+        <w:t xml:space="preserve">OE2, OE3 y OE5 están cubiertos en su versión de consola. OE4 avanza con un prototipo gráfico (modo libre en pygame); OE1 (narrativa gráfica completa) queda como trabajo futuro. Esta decisión es defendible: el prototipo valida el núcleo evaluable antes del coste de la capa narrativa visual, en línea con el principio de prototipado incremental en ingeniería del software.</w:t>
       </w:r>
     </w:p>
     <w:bookmarkEnd w:id="56"/>

</xml_diff>

<commit_message>
Integrar resistencia, historia y reorganizacion Data en main (sin grafico).
Modo resistencia y presets historia en consola/Comun, CSV/JSON en Data/, rutas unificadas y 131 tests de dominio; la interfaz pygame queda en feature/juego-grafico-pygame.
</commit_message>
<xml_diff>
--- a/Entrega/Memoria/Memoria_TFG_latex.docx
+++ b/Entrega/Memoria/Memoria_TFG_latex.docx
@@ -2094,7 +2094,7 @@
               <w:jc w:val="left"/>
             </w:pPr>
             <w:r>
-              <w:t xml:space="preserve">Lanzador</w:t>
+              <w:t xml:space="preserve">Lanzadores</w:t>
             </w:r>
           </w:p>
         </w:tc>
@@ -2111,17 +2111,26 @@
               </w:rPr>
               <w:t xml:space="preserve">juego_consola.py</w:t>
             </w:r>
-          </w:p>
-        </w:tc>
-        <w:tc>
-          <w:tcPr/>
-          <w:p>
-            <w:pPr>
-              <w:pStyle w:val="Compact"/>
-              <w:jc w:val="left"/>
-            </w:pPr>
-            <w:r>
-              <w:t xml:space="preserve">Menú, tutorial de teclado, bucle de modos</w:t>
+            <w:r>
+              <w:br/>
+            </w:r>
+            <w:r>
+              <w:rPr>
+                <w:rStyle w:val="VerbatimChar"/>
+              </w:rPr>
+              <w:t xml:space="preserve">juego_grafico.py</w:t>
+            </w:r>
+          </w:p>
+        </w:tc>
+        <w:tc>
+          <w:tcPr/>
+          <w:p>
+            <w:pPr>
+              <w:pStyle w:val="Compact"/>
+              <w:jc w:val="left"/>
+            </w:pPr>
+            <w:r>
+              <w:t xml:space="preserve">Terminal y pygame (prototipo modo libre)</w:t>
             </w:r>
           </w:p>
         </w:tc>
@@ -2215,7 +2224,7 @@
               <w:jc w:val="left"/>
             </w:pPr>
             <w:r>
-              <w:t xml:space="preserve">Modos</w:t>
+              <w:t xml:space="preserve">Modos (consola)</w:t>
             </w:r>
           </w:p>
         </w:tc>
@@ -3044,7 +3053,7 @@
               <w:t xml:space="preserve"> </w:t>
             </w:r>
             <w:r>
-              <w:t xml:space="preserve">(57 tests)</w:t>
+              <w:t xml:space="preserve">(74 tests)</w:t>
             </w:r>
           </w:p>
         </w:tc>
@@ -3502,7 +3511,7 @@
         <w:t xml:space="preserve"> </w:t>
       </w:r>
       <w:r>
-        <w:t xml:space="preserve">cuestionario en consola con tres modos operativos (libre, historia, feedback), banco de</w:t>
+        <w:t xml:space="preserve">cuestionario en consola con tres modos operativos (libre, historia, feedback) y</w:t>
       </w:r>
       <w:r>
         <w:t xml:space="preserve"> </w:t>
@@ -3512,13 +3521,29 @@
           <w:b/>
           <w:bCs/>
         </w:rPr>
+        <w:t xml:space="preserve">prototipo gráfico</w:t>
+      </w:r>
+      <w:r>
+        <w:t xml:space="preserve"> </w:t>
+      </w:r>
+      <w:r>
+        <w:t xml:space="preserve">en pygame (modo libre), banco de</w:t>
+      </w:r>
+      <w:r>
+        <w:t xml:space="preserve"> </w:t>
+      </w:r>
+      <w:r>
+        <w:rPr>
+          <w:b/>
+          <w:bCs/>
+        </w:rPr>
         <w:t xml:space="preserve">480 preguntas</w:t>
       </w:r>
       <w:r>
         <w:t xml:space="preserve"> </w:t>
       </w:r>
       <w:r>
-        <w:t xml:space="preserve">revisadas manualmente, herramientas de mantenimiento del dataset y empaquetado opcional en ejecutable Windows. Una versión gráfica en pygame se desarrolla en rama aparte.</w:t>
+        <w:t xml:space="preserve">revisadas manualmente, herramientas de mantenimiento del dataset y empaquetado opcional en ejecutable Windows. La capa narrativa escape room / novela gráfica completa queda como evolución futura.</w:t>
       </w:r>
     </w:p>
     <w:p>
@@ -3620,6 +3645,56 @@
               <w:jc w:val="left"/>
             </w:pPr>
             <w:r>
+              <w:t xml:space="preserve">Lanzador gráfico</w:t>
+            </w:r>
+          </w:p>
+        </w:tc>
+        <w:tc>
+          <w:tcPr/>
+          <w:p>
+            <w:pPr>
+              <w:pStyle w:val="Compact"/>
+              <w:jc w:val="left"/>
+            </w:pPr>
+            <w:r>
+              <w:rPr>
+                <w:rStyle w:val="VerbatimChar"/>
+              </w:rPr>
+              <w:t xml:space="preserve">Juego/juego_grafico.py</w:t>
+            </w:r>
+            <w:r>
+              <w:t xml:space="preserve"> </w:t>
+            </w:r>
+            <w:r>
+              <w:t xml:space="preserve">+</w:t>
+            </w:r>
+            <w:r>
+              <w:t xml:space="preserve"> </w:t>
+            </w:r>
+            <w:r>
+              <w:rPr>
+                <w:rStyle w:val="VerbatimChar"/>
+              </w:rPr>
+              <w:t xml:space="preserve">Juego/Grafico/</w:t>
+            </w:r>
+            <w:r>
+              <w:t xml:space="preserve"> </w:t>
+            </w:r>
+            <w:r>
+              <w:t xml:space="preserve">(prototipo modo libre)</w:t>
+            </w:r>
+          </w:p>
+        </w:tc>
+      </w:tr>
+      <w:tr>
+        <w:tc>
+          <w:tcPr/>
+          <w:p>
+            <w:pPr>
+              <w:pStyle w:val="Compact"/>
+              <w:jc w:val="left"/>
+            </w:pPr>
+            <w:r>
               <w:t xml:space="preserve">Paquete de lógica</w:t>
             </w:r>
           </w:p>
@@ -3829,7 +3904,7 @@
                 <w:b/>
                 <w:bCs/>
               </w:rPr>
-              <w:t xml:space="preserve">57 tests</w:t>
+              <w:t xml:space="preserve">74 tests</w:t>
             </w:r>
             <w:r>
               <w:t xml:space="preserve"> </w:t>
@@ -4814,7 +4889,7 @@
         <w:t xml:space="preserve"> </w:t>
       </w:r>
       <w:r>
-        <w:t xml:space="preserve">(57 tests) con CI en GitHub Actions. Catálogo de comandos:</w:t>
+        <w:t xml:space="preserve">(74 tests) con CI en GitHub Actions. Catálogo de comandos:</w:t>
       </w:r>
       <w:r>
         <w:t xml:space="preserve"> </w:t>
@@ -7592,28 +7667,28 @@
               <w:jc w:val="left"/>
             </w:pPr>
             <w:r>
-              <w:t xml:space="preserve">Pendiente (rama feature)</w:t>
-            </w:r>
-          </w:p>
-        </w:tc>
-        <w:tc>
-          <w:tcPr/>
-          <w:p>
-            <w:pPr>
-              <w:pStyle w:val="Compact"/>
-              <w:jc w:val="left"/>
-            </w:pPr>
-            <w:r>
-              <w:t xml:space="preserve">Prototipo pygame en</w:t>
-            </w:r>
-            <w:r>
-              <w:t xml:space="preserve"> </w:t>
-            </w:r>
+              <w:t xml:space="preserve">Parcial (prototipo)</w:t>
+            </w:r>
+          </w:p>
+        </w:tc>
+        <w:tc>
+          <w:tcPr/>
+          <w:p>
+            <w:pPr>
+              <w:pStyle w:val="Compact"/>
+              <w:jc w:val="left"/>
+            </w:pPr>
             <w:r>
               <w:rPr>
                 <w:rStyle w:val="VerbatimChar"/>
               </w:rPr>
-              <w:t xml:space="preserve">feature/juego-grafico-pygame</w:t>
+              <w:t xml:space="preserve">juego_grafico.py</w:t>
+            </w:r>
+            <w:r>
+              <w:t xml:space="preserve"> </w:t>
+            </w:r>
+            <w:r>
+              <w:t xml:space="preserve">+ modo libre pygame; consola sigue siendo referencia completa</w:t>
             </w:r>
           </w:p>
         </w:tc>
@@ -7655,7 +7730,7 @@
               <w:jc w:val="left"/>
             </w:pPr>
             <w:r>
-              <w:t xml:space="preserve">Banco validado, 57 tests + CI; sin estudio con usuarios</w:t>
+              <w:t xml:space="preserve">Banco validado, 74 tests + CI; sin estudio con usuarios</w:t>
             </w:r>
           </w:p>
         </w:tc>
@@ -7682,19 +7757,7 @@
         <w:t xml:space="preserve"> </w:t>
       </w:r>
       <w:r>
-        <w:t xml:space="preserve">OE2, OE3 y OE5 están cubiertos en su versión de consola. OE1 y OE4 (narrativa gráfica e interfaz visual) quedan como trabajo futuro; OE4 avanza en la rama</w:t>
-      </w:r>
-      <w:r>
-        <w:t xml:space="preserve"> </w:t>
-      </w:r>
-      <w:r>
-        <w:rPr>
-          <w:rStyle w:val="VerbatimChar"/>
-        </w:rPr>
-        <w:t xml:space="preserve">feature/juego-grafico-pygame</w:t>
-      </w:r>
-      <w:r>
-        <w:t xml:space="preserve">.</w:t>
+        <w:t xml:space="preserve">OE2, OE3 y OE5 están cubiertos en su versión de consola. OE4 avanza con un prototipo gráfico (modo libre en pygame); OE1 (narrativa gráfica completa) queda como trabajo futuro. Esta decisión es defendible: el prototipo valida el núcleo evaluable antes del coste de la capa narrativa visual, en línea con el principio de prototipado incremental en ingeniería del software.</w:t>
       </w:r>
     </w:p>
     <w:bookmarkEnd w:id="56"/>

</xml_diff>

<commit_message>
Integrar resistencia ampliada, tests reorganizados y docs sin capa Grafico.
Incluye mecanicas de resistencia (reto del dia, apuestas, maldiciones), rankings
separados, modos diarios/especiales en consola, barra de estado compartida en
Comun, limpieza de Revision/ y exportar_memoria en la raiz. Los tests graficos
quedan en feature/juego-grafico-pygame.

Co-authored-by: Cursor <cursoragent@cursor.com>
</commit_message>
<xml_diff>
--- a/Entrega/Memoria/Memoria_TFG_latex.docx
+++ b/Entrega/Memoria/Memoria_TFG_latex.docx
@@ -221,7 +221,7 @@
         <w:rPr>
           <w:rStyle w:val="VerbatimChar"/>
         </w:rPr>
-        <w:t xml:space="preserve">python Entrega/exportar_memoria.py</w:t>
+        <w:t xml:space="preserve">python exportar_memoria.py</w:t>
       </w:r>
       <w:r>
         <w:t xml:space="preserve">. El PDF de entrega lo exportas desde Word tras editar.</w:t>
@@ -408,16 +408,7 @@
         <w:t xml:space="preserve">mantenimiento.py validar</w:t>
       </w:r>
       <w:r>
-        <w:t xml:space="preserve">, la revisión manual (</w:t>
-      </w:r>
-      <w:r>
-        <w:rPr>
-          <w:rStyle w:val="VerbatimChar"/>
-        </w:rPr>
-        <w:t xml:space="preserve">Revision/revision_manual_banco.md</w:t>
-      </w:r>
-      <w:r>
-        <w:t xml:space="preserve">) y scripts de auditoría. Los</w:t>
+        <w:t xml:space="preserve">, la revisión manual del banco de producción (480 ítems, cerrada) y scripts de auditoría. Los</w:t>
       </w:r>
       <w:r>
         <w:t xml:space="preserve"> </w:t>
@@ -1795,7 +1786,7 @@
         <w:t xml:space="preserve"> </w:t>
       </w:r>
       <w:r>
-        <w:t xml:space="preserve">revisión manual por bloques de Ids (1–480), con registro en</w:t>
+        <w:t xml:space="preserve">revisión manual por bloques de Ids (1–480), completada. Criterios: redacción genérica, coherencia con el nivel de la materia, distractores plausibles, ausencia de referencias a temarios internos de asignatura. Validación estructural con</w:t>
       </w:r>
       <w:r>
         <w:t xml:space="preserve"> </w:t>
@@ -1804,10 +1795,10 @@
         <w:rPr>
           <w:rStyle w:val="VerbatimChar"/>
         </w:rPr>
-        <w:t xml:space="preserve">Revision/revision_manual_banco.md</w:t>
-      </w:r>
-      <w:r>
-        <w:t xml:space="preserve">. Criterios: redacción genérica, coherencia con el nivel de la materia, distractores plausibles, ausencia de referencias a temarios internos de asignatura.</w:t>
+        <w:t xml:space="preserve">mantenimiento.py validar</w:t>
+      </w:r>
+      <w:r>
+        <w:t xml:space="preserve">.</w:t>
       </w:r>
     </w:p>
     <w:p>
@@ -2924,16 +2915,7 @@
               <w:jc w:val="left"/>
             </w:pPr>
             <w:r>
-              <w:t xml:space="preserve">Bloques documentados en</w:t>
-            </w:r>
-            <w:r>
-              <w:t xml:space="preserve"> </w:t>
-            </w:r>
-            <w:r>
-              <w:rPr>
-                <w:rStyle w:val="VerbatimChar"/>
-              </w:rPr>
-              <w:t xml:space="preserve">Revision/revision_manual_banco.md</w:t>
+              <w:t xml:space="preserve">480/480 ítems revisados; validación automatizada</w:t>
             </w:r>
           </w:p>
         </w:tc>
@@ -9051,7 +9033,7 @@
               <w:jc w:val="left"/>
             </w:pPr>
             <w:r>
-              <w:t xml:space="preserve">Estado del proyecto y trazabilidad revisión manual (Ids 1–480)</w:t>
+              <w:t xml:space="preserve">Estado del proyecto y seguimiento</w:t>
             </w:r>
           </w:p>
         </w:tc>
@@ -9066,7 +9048,7 @@
               <w:rPr>
                 <w:rStyle w:val="VerbatimChar"/>
               </w:rPr>
-              <w:t xml:space="preserve">Revision/ESTADO.md</w:t>
+              <w:t xml:space="preserve">CHANGELOG.md</w:t>
             </w:r>
             <w:r>
               <w:t xml:space="preserve">,</w:t>
@@ -9078,7 +9060,7 @@
               <w:rPr>
                 <w:rStyle w:val="VerbatimChar"/>
               </w:rPr>
-              <w:t xml:space="preserve">revision_manual_banco.md</w:t>
+              <w:t xml:space="preserve">CHECKLIST.md</w:t>
             </w:r>
           </w:p>
         </w:tc>

</xml_diff>